<commit_message>
JS update - colour tab
Fixed tab with colour selection.
Now only valid Hex and text colors will pass.
Huge thanks for bobspace on GitHub for color array!
Need to add rgb, rgba, hsl and hsla support.
</commit_message>
<xml_diff>
--- a/ToDo.docx
+++ b/ToDo.docx
@@ -442,8 +442,138 @@
         </w:rPr>
         <w:t>OPTIMALIZATION</w:t>
       </w:r>
+    </w:p>
+    <w:p>
+      <w:pPr>
+        <w:pStyle w:val="Akapitzlist"/>
+        <w:numPr>
+          <w:ilvl w:val="0"/>
+          <w:numId w:val="4"/>
+        </w:numPr>
+        <w:rPr>
+          <w:strike/>
+          <w:lang w:val="en-US"/>
+        </w:rPr>
+      </w:pPr>
+      <w:r>
+        <w:rPr>
+          <w:strike/>
+          <w:lang w:val="en-US"/>
+        </w:rPr>
+        <w:t xml:space="preserve">Fix </w:t>
+      </w:r>
+      <w:proofErr w:type="spellStart"/>
+      <w:r>
+        <w:rPr>
+          <w:strike/>
+          <w:lang w:val="en-US"/>
+        </w:rPr>
+        <w:t>colour</w:t>
+      </w:r>
+      <w:proofErr w:type="spellEnd"/>
+      <w:r>
+        <w:rPr>
+          <w:strike/>
+          <w:lang w:val="en-US"/>
+        </w:rPr>
+        <w:t xml:space="preserve"> selection tab</w:t>
+      </w:r>
+    </w:p>
+    <w:p>
+      <w:pPr>
+        <w:pStyle w:val="Akapitzlist"/>
+        <w:numPr>
+          <w:ilvl w:val="0"/>
+          <w:numId w:val="4"/>
+        </w:numPr>
+        <w:rPr>
+          <w:lang w:val="en-US"/>
+        </w:rPr>
+      </w:pPr>
+      <w:r>
+        <w:rPr>
+          <w:lang w:val="en-US"/>
+        </w:rPr>
+        <w:t xml:space="preserve">Add </w:t>
+      </w:r>
+      <w:proofErr w:type="spellStart"/>
+      <w:r>
+        <w:rPr>
+          <w:lang w:val="en-US"/>
+        </w:rPr>
+        <w:t>rgb</w:t>
+      </w:r>
+      <w:proofErr w:type="spellEnd"/>
+      <w:r>
+        <w:rPr>
+          <w:lang w:val="en-US"/>
+        </w:rPr>
+        <w:t xml:space="preserve">, </w:t>
+      </w:r>
+      <w:proofErr w:type="spellStart"/>
+      <w:r>
+        <w:rPr>
+          <w:lang w:val="en-US"/>
+        </w:rPr>
+        <w:t>rgba</w:t>
+      </w:r>
+      <w:proofErr w:type="spellEnd"/>
+      <w:r>
+        <w:rPr>
+          <w:lang w:val="en-US"/>
+        </w:rPr>
+        <w:t xml:space="preserve">, </w:t>
+      </w:r>
+      <w:proofErr w:type="spellStart"/>
+      <w:r>
+        <w:rPr>
+          <w:lang w:val="en-US"/>
+        </w:rPr>
+        <w:t>hsl</w:t>
+      </w:r>
+      <w:proofErr w:type="spellEnd"/>
+      <w:r>
+        <w:rPr>
+          <w:lang w:val="en-US"/>
+        </w:rPr>
+        <w:t xml:space="preserve">, </w:t>
+      </w:r>
+      <w:proofErr w:type="spellStart"/>
+      <w:r>
+        <w:rPr>
+          <w:lang w:val="en-US"/>
+        </w:rPr>
+        <w:t>hsla</w:t>
+      </w:r>
+      <w:proofErr w:type="spellEnd"/>
+      <w:r>
+        <w:rPr>
+          <w:lang w:val="en-US"/>
+        </w:rPr>
+        <w:t xml:space="preserve"> suppo</w:t>
+      </w:r>
       <w:bookmarkStart w:id="0" w:name="_GoBack"/>
       <w:bookmarkEnd w:id="0"/>
+      <w:r>
+        <w:rPr>
+          <w:lang w:val="en-US"/>
+        </w:rPr>
+        <w:t xml:space="preserve">rt in </w:t>
+      </w:r>
+      <w:proofErr w:type="spellStart"/>
+      <w:r>
+        <w:rPr>
+          <w:lang w:val="en-US"/>
+        </w:rPr>
+        <w:t>colour</w:t>
+      </w:r>
+      <w:proofErr w:type="spellEnd"/>
+      <w:r>
+        <w:rPr>
+          <w:lang w:val="en-US"/>
+        </w:rPr>
+        <w:t xml:space="preserve"> selection tab</w:t>
+      </w:r>
     </w:p>
     <w:sectPr>
       <w:pgSz w:w="11906" w:h="16838"/>

</xml_diff>